<commit_message>
Release 2026.10.01.01: batch recognition review, DB panel and axis centering
</commit_message>
<xml_diff>
--- a/개발소스/고객용_실행폴더/라벨출력패키지_고객용_매뉴얼.docx
+++ b/개발소스/고객용_실행폴더/라벨출력패키지_고객용_매뉴얼.docx
@@ -369,7 +369,7 @@
                 <w:color w:val="111827"/>
                 <w:sz w:val="20"/>
               </w:rPr>
-              <w:t>2.1 / 2026-09-30</w:t>
+              <w:t>2.2 / 2026-10-01</w:t>
             </w:r>
           </w:p>
         </w:tc>
@@ -6697,7 +6697,7 @@
                 <w:color w:val="111827"/>
                 <w:sz w:val="20"/>
               </w:rPr>
-              <w:t>실제 용지의 가로·세로(mm)를 입력하고 텍스트, 1D/2D 바코드, 그림, 박스, 선, 표를 넣습니다. 개체 속성에서 크기와 위치를 확인합니다.</w:t>
+              <w:t>실제 용지의 가로·세로(mm)를 입력하고 텍스트, 1D/2D 바코드, 그림, 박스, 선, 표를 넣습니다. 개체를 더블클릭해 크기와 위치를 확인합니다. 오른쪽은 상품 DB 메뉴만 표시합니다. 상단 좌우 가운데 정렬·상하 가운데 정렬로 가로·세로 중심에 배치합니다.</w:t>
             </w:r>
           </w:p>
         </w:tc>
@@ -6929,7 +6929,7 @@
           <w:color w:val="111827"/>
           <w:sz w:val="22"/>
         </w:rPr>
-        <w:t>도안 불러오기에서 PNG/JPG/PSD를 선택하고 도안 적용을 누르면 편집 가능한 후보 개체가 생성됩니다. 인식 값 검토에서 원본 이미지와 후보를 나란히 비교해 글자·바코드 값을 직접 수정하고 확인해야 출력할 수 있습니다.</w:t>
+        <w:t>도안 불러오기에서 PNG/JPG/PSD를 선택하고 도안 적용을 누르면 편집 가능한 후보 개체가 생성됩니다. 인식 값 검토에서 원본 이미지와 후보를 나란히 비교해 잘못된 글자·바코드를 먼저 수정한 뒤 전체 값 확인을 누르면 한 번에 확정됩니다. 빈 값·임시 바코드가 있으면 전체 확인을 막습니다.</w:t>
       </w:r>
     </w:p>
     <w:p>
@@ -6955,7 +6955,7 @@
           <w:color w:val="111827"/>
           <w:sz w:val="22"/>
         </w:rPr>
-        <w:t>BarTender .btw 파일은 직접 열 수 없습니다. 원본 도안을 PNG로 내보내어 참고 도안으로 불러온 뒤 개체와 데이터 열을 다시 연결합니다. 수식·변수·프린터 설정까지 자동 변환되는 기능은 아닙니다.</w:t>
+        <w:t>BarTender .btw 파일은 직접 열 수 없습니다. 파일명만 .png로 바꾸지 말고 원본 프로그램에서 실제 이미지로 내보내어 참고 도안으로 불러온 뒤 개체와 데이터 열을 다시 연결합니다. 수식·변수·프린터 설정까지 자동 변환되는 기능은 아닙니다.</w:t>
       </w:r>
     </w:p>
     <w:tbl>
@@ -9727,7 +9727,7 @@
                 <w:color w:val="111827"/>
                 <w:sz w:val="20"/>
               </w:rPr>
-              <w:t>.btw 직접 열기는 지원하지 않습니다. BarTender에서 PNG로 내보낸 뒤 도안 불러오기로 재작성하고 필드·바코드·인쇄 결과를 확인합니다.</w:t>
+              <w:t>.btw 직접 열기는 지원하지 않습니다. 원본 프로그램에서 실제 이미지로 내보내거나 인쇄 미리보기를 저장한 뒤 도안 불러오기로 재작성하고 필드·바코드·인쇄 결과를 확인합니다.</w:t>
             </w:r>
           </w:p>
         </w:tc>

</xml_diff>